<commit_message>
Testing for .NET 11 Preview 6
</commit_message>
<xml_diff>
--- a/src/CoreDesign.Shared/README.docx
+++ b/src/CoreDesign.Shared/README.docx
@@ -2,7 +2,7 @@
 <file path=word/document.xml><?xml version="1.0" encoding="utf-8"?>
 <w:document xmlns:w="http://schemas.openxmlformats.org/wordprocessingml/2006/main" xmlns:m="http://schemas.openxmlformats.org/officeDocument/2006/math" xmlns:r="http://schemas.openxmlformats.org/officeDocument/2006/relationships" xmlns:o="urn:schemas-microsoft-com:office:office" xmlns:v="urn:schemas-microsoft-com:vml" xmlns:w10="urn:schemas-microsoft-com:office:word" xmlns:a="http://schemas.openxmlformats.org/drawingml/2006/main" xmlns:pic="http://schemas.openxmlformats.org/drawingml/2006/picture" xmlns:wp="http://schemas.openxmlformats.org/drawingml/2006/wordprocessingDrawing">
   <w:body>
-    <w:bookmarkStart w:id="15" w:name="coredesign.shared"/>
+    <w:bookmarkStart w:id="18" w:name="coredesign.shared"/>
     <w:p>
       <w:pPr>
         <w:pStyle w:val="Heading1"/>
@@ -583,7 +583,7 @@
         <w:pStyle w:val="BodyText"/>
       </w:pPr>
       <w:r>
-        <w:t xml:space="preserve">Lightweight result records for use with discriminated unions (e.g.,</w:t>
+        <w:t xml:space="preserve">Lightweight result records for use with discriminated unions (e.g., native C#</w:t>
       </w:r>
       <w:r>
         <w:t xml:space="preserve"> </w:t>
@@ -592,10 +592,13 @@
         <w:rPr>
           <w:rStyle w:val="VerbatimChar"/>
         </w:rPr>
-        <w:t xml:space="preserve">OneOf</w:t>
-      </w:r>
-      <w:r>
-        <w:t xml:space="preserve">):</w:t>
+        <w:t xml:space="preserve">union</w:t>
+      </w:r>
+      <w:r>
+        <w:t xml:space="preserve"> </w:t>
+      </w:r>
+      <w:r>
+        <w:t xml:space="preserve">types):</w:t>
       </w:r>
     </w:p>
     <w:tbl>
@@ -1928,7 +1931,7 @@
           <w:b/>
           <w:bCs/>
         </w:rPr>
-        <w:t xml:space="preserve">Error results with OneOf</w:t>
+        <w:t xml:space="preserve">Error results with native unions</w:t>
       </w:r>
     </w:p>
     <w:p>
@@ -1945,6 +1948,60 @@
         <w:rPr>
           <w:rStyle w:val="NormalTok"/>
         </w:rPr>
+        <w:t xml:space="preserve"> union </w:t>
+      </w:r>
+      <w:r>
+        <w:rPr>
+          <w:rStyle w:val="FunctionTok"/>
+        </w:rPr>
+        <w:t xml:space="preserve">GetResult</w:t>
+      </w:r>
+      <w:r>
+        <w:rPr>
+          <w:rStyle w:val="OperatorTok"/>
+        </w:rPr>
+        <w:t xml:space="preserve">(</w:t>
+      </w:r>
+      <w:r>
+        <w:rPr>
+          <w:rStyle w:val="NormalTok"/>
+        </w:rPr>
+        <w:t xml:space="preserve">Widget</w:t>
+      </w:r>
+      <w:r>
+        <w:rPr>
+          <w:rStyle w:val="OperatorTok"/>
+        </w:rPr>
+        <w:t xml:space="preserve">,</w:t>
+      </w:r>
+      <w:r>
+        <w:rPr>
+          <w:rStyle w:val="NormalTok"/>
+        </w:rPr>
+        <w:t xml:space="preserve"> NotFoundMessage</w:t>
+      </w:r>
+      <w:r>
+        <w:rPr>
+          <w:rStyle w:val="OperatorTok"/>
+        </w:rPr>
+        <w:t xml:space="preserve">);</w:t>
+      </w:r>
+      <w:r>
+        <w:br/>
+      </w:r>
+      <w:r>
+        <w:br/>
+      </w:r>
+      <w:r>
+        <w:rPr>
+          <w:rStyle w:val="KeywordTok"/>
+        </w:rPr>
+        <w:t xml:space="preserve">public</w:t>
+      </w:r>
+      <w:r>
+        <w:rPr>
+          <w:rStyle w:val="NormalTok"/>
+        </w:rPr>
         <w:t xml:space="preserve"> async Task</w:t>
       </w:r>
       <w:r>
@@ -1957,37 +2014,13 @@
         <w:rPr>
           <w:rStyle w:val="NormalTok"/>
         </w:rPr>
-        <w:t xml:space="preserve">OneOf</w:t>
-      </w:r>
-      <w:r>
-        <w:rPr>
-          <w:rStyle w:val="OperatorTok"/>
-        </w:rPr>
-        <w:t xml:space="preserve">&lt;</w:t>
-      </w:r>
-      <w:r>
-        <w:rPr>
-          <w:rStyle w:val="NormalTok"/>
-        </w:rPr>
-        <w:t xml:space="preserve">Widget</w:t>
-      </w:r>
-      <w:r>
-        <w:rPr>
-          <w:rStyle w:val="OperatorTok"/>
-        </w:rPr>
-        <w:t xml:space="preserve">,</w:t>
-      </w:r>
-      <w:r>
-        <w:rPr>
-          <w:rStyle w:val="NormalTok"/>
-        </w:rPr>
-        <w:t xml:space="preserve"> NotFoundMessage</w:t>
-      </w:r>
-      <w:r>
-        <w:rPr>
-          <w:rStyle w:val="OperatorTok"/>
-        </w:rPr>
-        <w:t xml:space="preserve">&gt;&gt;</w:t>
+        <w:t xml:space="preserve">GetResult</w:t>
+      </w:r>
+      <w:r>
+        <w:rPr>
+          <w:rStyle w:val="OperatorTok"/>
+        </w:rPr>
+        <w:t xml:space="preserve">&gt;</w:t>
       </w:r>
       <w:r>
         <w:rPr>
@@ -2648,7 +2681,56 @@
       </w:r>
     </w:p>
     <w:bookmarkEnd w:id="14"/>
-    <w:bookmarkEnd w:id="15"/>
+    <w:bookmarkStart w:id="17" w:name="feedback"/>
+    <w:p>
+      <w:pPr>
+        <w:pStyle w:val="Heading2"/>
+      </w:pPr>
+      <w:r>
+        <w:t xml:space="preserve">Feedback</w:t>
+      </w:r>
+    </w:p>
+    <w:p>
+      <w:pPr>
+        <w:pStyle w:val="FirstParagraph"/>
+      </w:pPr>
+      <w:r>
+        <w:t xml:space="preserve">Feedback on this package is welcome. If you run into a missing feature, an unexpected behavior, or something that required more effort than it should have, open an issue at</w:t>
+      </w:r>
+      <w:r>
+        <w:t xml:space="preserve"> </w:t>
+      </w:r>
+      <w:hyperlink r:id="rId15">
+        <w:r>
+          <w:rPr>
+            <w:rStyle w:val="Hyperlink"/>
+          </w:rPr>
+          <w:t xml:space="preserve">github.com/codyskidmore/CoreDesign/issues</w:t>
+        </w:r>
+      </w:hyperlink>
+      <w:r>
+        <w:t xml:space="preserve"> </w:t>
+      </w:r>
+      <w:r>
+        <w:t xml:space="preserve">or tag</w:t>
+      </w:r>
+      <w:r>
+        <w:t xml:space="preserve"> </w:t>
+      </w:r>
+      <w:hyperlink r:id="rId16">
+        <w:r>
+          <w:rPr>
+            <w:rStyle w:val="Hyperlink"/>
+          </w:rPr>
+          <w:t xml:space="preserve">@codyskidmore</w:t>
+        </w:r>
+      </w:hyperlink>
+      <w:r>
+        <w:t xml:space="preserve">. Suggestions about missing features and priority input are especially appreciated.</w:t>
+      </w:r>
+    </w:p>
+    <w:bookmarkEnd w:id="17"/>
+    <w:bookmarkEnd w:id="18"/>
     <w:sectPr>
       <w:footnotePr>
         <w:numRestart w:val="eachSect"/>

</xml_diff>